<commit_message>
court(texcrimapp) petition-for-discretionary-review docx: TeX Gyre Pagella (DEF-FONT-002), leader entries as right dot-leader tab paragraphs (DEF-TOC-001), exact heading and single-spaced line heights (DEF-FORM-002); docx check green (fb-595.59)
</commit_message>
<xml_diff>
--- a/courts/fifth-circuit/texas/state/court-of-criminal-appeals/petition-for-discretionary-review/docx/reference.docx
+++ b/courts/fifth-circuit/texas/state/court-of-criminal-appeals/petition-for-discretionary-review/docx/reference.docx
@@ -538,7 +538,7 @@
   <w:docDefaults>
     <w:rPrDefault>
       <w:rPr>
-        <w:rFonts w:ascii="EB Garamond" w:hAnsi="EB Garamond" w:eastAsia="EB Garamond" w:cs="EB Garamond"/>
+        <w:rFonts w:ascii="TeX Gyre Pagella" w:hAnsi="TeX Gyre Pagella" w:eastAsia="TeX Gyre Pagella" w:cs="TeX Gyre Pagella"/>
         <w:sz w:val="28"/>
         <w:szCs w:val="28"/>
         <w:lang w:val="en-US" w:eastAsia="zh-CN" w:bidi="ar-SA"/>
@@ -729,13 +729,13 @@
     <w:pPr>
       <w:keepNext/>
       <w:keepLines/>
-      <w:spacing w:before="308" w:after="224" w:line="240" w:lineRule="auto"/>
+      <w:spacing w:before="308" w:after="224" w:line="440" w:lineRule="exact"/>
       <w:ind w:firstLine="0"/>
       <w:jc w:val="center"/>
       <w:outlineLvl w:val="0"/>
     </w:pPr>
     <w:rPr>
-      <w:rFonts w:ascii="EB Garamond" w:hAnsi="EB Garamond" w:eastAsia="EB Garamond" w:cs="EB Garamond"/>
+      <w:rFonts w:ascii="TeX Gyre Pagella" w:hAnsi="TeX Gyre Pagella" w:eastAsia="TeX Gyre Pagella" w:cs="TeX Gyre Pagella"/>
       <w:b/>
       <w:bCs/>
       <w:caps/>
@@ -754,13 +754,13 @@
     <w:pPr>
       <w:keepNext/>
       <w:keepLines/>
-      <w:spacing w:before="224" w:after="196" w:line="240" w:lineRule="auto"/>
+      <w:spacing w:before="224" w:after="196" w:line="440" w:lineRule="exact"/>
       <w:ind w:firstLine="0"/>
       <w:jc w:val="left"/>
       <w:outlineLvl w:val="1"/>
     </w:pPr>
     <w:rPr>
-      <w:rFonts w:ascii="EB Garamond" w:hAnsi="EB Garamond" w:eastAsia="EB Garamond" w:cs="EB Garamond"/>
+      <w:rFonts w:ascii="TeX Gyre Pagella" w:hAnsi="TeX Gyre Pagella" w:eastAsia="TeX Gyre Pagella" w:cs="TeX Gyre Pagella"/>
       <w:b/>
       <w:bCs/>
       <w:color w:val="000000"/>
@@ -778,13 +778,13 @@
     <w:pPr>
       <w:keepNext/>
       <w:keepLines/>
-      <w:spacing w:before="168" w:after="98" w:line="240" w:lineRule="auto"/>
+      <w:spacing w:before="168" w:after="98" w:line="440" w:lineRule="exact"/>
       <w:ind w:firstLine="0"/>
       <w:jc w:val="left"/>
       <w:outlineLvl w:val="2"/>
     </w:pPr>
     <w:rPr>
-      <w:rFonts w:ascii="EB Garamond" w:hAnsi="EB Garamond" w:eastAsia="EB Garamond" w:cs="EB Garamond"/>
+      <w:rFonts w:ascii="TeX Gyre Pagella" w:hAnsi="TeX Gyre Pagella" w:eastAsia="TeX Gyre Pagella" w:cs="TeX Gyre Pagella"/>
       <w:i/>
       <w:iCs/>
       <w:color w:val="000000"/>
@@ -1223,9 +1223,20 @@
     <w:qFormat/>
     <w:pPr>
       <w:keepLines/>
-      <w:spacing w:before="0" w:after="154" w:line="240" w:lineRule="auto"/>
+      <w:spacing w:before="0" w:after="40" w:line="400" w:lineRule="exact"/>
       <w:ind w:firstLine="0"/>
       <w:jc w:val="left"/>
+    </w:pPr>
+  </w:style>
+  <w:style w:type="paragraph" w:customStyle="1" w:styleId="LeaderEntry">
+    <w:name w:val="Leader Entry"/>
+    <w:basedOn w:val="Single"/>
+    <w:qFormat/>
+    <w:pPr>
+      <w:tabs>
+        <w:tab w:val="right" w:leader="dot" w:pos="9360"/>
+      </w:tabs>
+      <w:ind w:left="720" w:right="0" w:hanging="720"/>
     </w:pPr>
   </w:style>
   <w:style w:type="paragraph" w:styleId="Footer">

</xml_diff>